<commit_message>
feat(operations): refine contract and finance workflows
</commit_message>
<xml_diff>
--- a/tai-lieu/HD-COC-GIU-PHONG.docx
+++ b/tai-lieu/HD-COC-GIU-PHONG.docx
@@ -1,6 +1,6 @@
 
 <file path=word/document.xml><?xml version="1.0" encoding="utf-8"?>
-<w:document xmlns:wpc="http://schemas.microsoft.com/office/word/2010/wordprocessingCanvas" xmlns:cx="http://schemas.microsoft.com/office/drawing/2014/chartex" xmlns:cx1="http://schemas.microsoft.com/office/drawing/2015/9/8/chartex" xmlns:cx2="http://schemas.microsoft.com/office/drawing/2015/10/21/chartex" xmlns:cx3="http://schemas.microsoft.com/office/drawing/2016/5/9/chartex" xmlns:cx4="http://schemas.microsoft.com/office/drawing/2016/5/10/chartex" xmlns:cx5="http://schemas.microsoft.com/office/drawing/2016/5/11/chartex" xmlns:cx6="http://schemas.microsoft.com/office/drawing/2016/5/12/chartex" xmlns:cx7="http://schemas.microsoft.com/office/drawing/2016/5/13/chartex" xmlns:cx8="http://schemas.microsoft.com/office/drawing/2016/5/14/chartex" xmlns:mc="http://schemas.openxmlformats.org/markup-compatibility/2006" xmlns:aink="http://schemas.microsoft.com/office/drawing/2016/ink" xmlns:am3d="http://schemas.microsoft.com/office/drawing/2017/model3d" xmlns:o="urn:schemas-microsoft-com:office:office" xmlns:oel="http://schemas.microsoft.com/office/2019/extlst" xmlns:r="http://schemas.openxmlformats.org/officeDocument/2006/relationships" xmlns:m="http://schemas.openxmlformats.org/officeDocument/2006/math" xmlns:v="urn:schemas-microsoft-com:vml" xmlns:wp14="http://schemas.microsoft.com/office/word/2010/wordprocessingDrawing" xmlns:wp="http://schemas.openxmlformats.org/drawingml/2006/wordprocessingDrawing" xmlns:w10="urn:schemas-microsoft-com:office:word" xmlns:w="http://schemas.openxmlformats.org/wordprocessingml/2006/main" xmlns:w14="http://schemas.microsoft.com/office/word/2010/wordml" xmlns:w15="http://schemas.microsoft.com/office/word/2012/wordml" xmlns:w16cei="http://schemas.microsoft.com/office/word/2026/wordml/cei" xmlns:w16cex="http://schemas.microsoft.com/office/word/2018/wordml/cex" xmlns:w16cid="http://schemas.microsoft.com/office/word/2016/wordml/cid" xmlns:w16="http://schemas.microsoft.com/office/word/2018/wordml" xmlns:w16du="http://schemas.microsoft.com/office/word/2023/wordml/word16du" xmlns:w16sdtdh="http://schemas.microsoft.com/office/word/2020/wordml/sdtdatahash" xmlns:w16sdtfl="http://schemas.microsoft.com/office/word/2024/wordml/sdtformatlock" xmlns:w16se="http://schemas.microsoft.com/office/word/2015/wordml/symex" xmlns:wpg="http://schemas.microsoft.com/office/word/2010/wordprocessingGroup" xmlns:wpi="http://schemas.microsoft.com/office/word/2010/wordprocessingInk" xmlns:wne="http://schemas.microsoft.com/office/word/2006/wordml" xmlns:wps="http://schemas.microsoft.com/office/word/2010/wordprocessingShape" mc:Ignorable="w14 w15 w16se w16cid w16 w16cex w16sdtdh w16sdtfl w16du wp14">
+<w:document xmlns:wpc="http://schemas.microsoft.com/office/word/2010/wordprocessingCanvas" xmlns:cx="http://schemas.microsoft.com/office/drawing/2014/chartex" xmlns:cx1="http://schemas.microsoft.com/office/drawing/2015/9/8/chartex" xmlns:cx2="http://schemas.microsoft.com/office/drawing/2015/10/21/chartex" xmlns:cx3="http://schemas.microsoft.com/office/drawing/2016/5/9/chartex" xmlns:cx4="http://schemas.microsoft.com/office/drawing/2016/5/10/chartex" xmlns:cx5="http://schemas.microsoft.com/office/drawing/2016/5/11/chartex" xmlns:cx6="http://schemas.microsoft.com/office/drawing/2016/5/12/chartex" xmlns:cx7="http://schemas.microsoft.com/office/drawing/2016/5/13/chartex" xmlns:cx8="http://schemas.microsoft.com/office/drawing/2016/5/14/chartex" xmlns:mc="http://schemas.openxmlformats.org/markup-compatibility/2006" xmlns:aink="http://schemas.microsoft.com/office/drawing/2016/ink" xmlns:am3d="http://schemas.microsoft.com/office/drawing/2017/model3d" xmlns:o="urn:schemas-microsoft-com:office:office" xmlns:oel="http://schemas.microsoft.com/office/2019/extlst" xmlns:r="http://schemas.openxmlformats.org/officeDocument/2006/relationships" xmlns:m="http://schemas.openxmlformats.org/officeDocument/2006/math" xmlns:v="urn:schemas-microsoft-com:vml" xmlns:wp14="http://schemas.microsoft.com/office/word/2010/wordprocessingDrawing" xmlns:wp="http://schemas.openxmlformats.org/drawingml/2006/wordprocessingDrawing" xmlns:w10="urn:schemas-microsoft-com:office:word" xmlns:w="http://schemas.openxmlformats.org/wordprocessingml/2006/main" xmlns:w14="http://schemas.microsoft.com/office/word/2010/wordml" xmlns:w15="http://schemas.microsoft.com/office/word/2012/wordml" xmlns:w16cex="http://schemas.microsoft.com/office/word/2018/wordml/cex" xmlns:w16cid="http://schemas.microsoft.com/office/word/2016/wordml/cid" xmlns:w16="http://schemas.microsoft.com/office/word/2018/wordml" xmlns:w16du="http://schemas.microsoft.com/office/word/2023/wordml/word16du" xmlns:w16sdtdh="http://schemas.microsoft.com/office/word/2020/wordml/sdtdatahash" xmlns:w16sdtfl="http://schemas.microsoft.com/office/word/2024/wordml/sdtformatlock" xmlns:w16se="http://schemas.microsoft.com/office/word/2015/wordml/symex" xmlns:wpg="http://schemas.microsoft.com/office/word/2010/wordprocessingGroup" xmlns:wpi="http://schemas.microsoft.com/office/word/2010/wordprocessingInk" xmlns:wne="http://schemas.microsoft.com/office/word/2006/wordml" xmlns:wps="http://schemas.microsoft.com/office/word/2010/wordprocessingShape" mc:Ignorable="w14 w15 w16se w16cid w16 w16cex w16sdtdh w16sdtfl w16du wp14">
   <w:body>
     <w:p>
       <w:pPr>
@@ -24,15 +24,6 @@
         </w:rPr>
         <w:t>THỎA THUẬN ĐẶT CỌC GIỮ PHÒNG</w:t>
       </w:r>
-      <w:r>
-        <w:rPr>
-          <w:rFonts w:ascii="Times New Roman" w:hAnsi="Times New Roman" w:cs="Times New Roman"/>
-          <w:b/>
-          <w:bCs/>
-          <w:sz w:val="32"/>
-          <w:szCs w:val="32"/>
-        </w:rPr>
-      </w:r>
     </w:p>
     <w:p>
       <w:pPr>
@@ -47,35 +38,6 @@
           <w:sz w:val="26"/>
         </w:rPr>
         <w:t>Hôm nay, ngày {ngayKyHD} tháng {thangKyHD} năm {namKyHD}, tại {toaNha}</w:t>
-      </w:r>
-      <w:proofErr w:type="gramStart"/>
-      <w:r>
-        <w:rPr>
-          <w:rFonts w:ascii="Times New Roman" w:hAnsi="Times New Roman" w:cs="Times New Roman"/>
-        </w:rPr>
-      </w:r>
-      <w:proofErr w:type="gramEnd"/>
-      <w:r>
-        <w:rPr>
-          <w:rFonts w:ascii="Times New Roman" w:hAnsi="Times New Roman" w:cs="Times New Roman"/>
-        </w:rPr>
-      </w:r>
-      <w:proofErr w:type="gramStart"/>
-      <w:r>
-        <w:rPr>
-          <w:rFonts w:ascii="Times New Roman" w:hAnsi="Times New Roman" w:cs="Times New Roman"/>
-        </w:rPr>
-      </w:r>
-      <w:proofErr w:type="gramEnd"/>
-      <w:r>
-        <w:rPr>
-          <w:rFonts w:ascii="Times New Roman" w:hAnsi="Times New Roman" w:cs="Times New Roman"/>
-        </w:rPr>
-      </w:r>
-      <w:r>
-        <w:rPr>
-          <w:rFonts w:ascii="Times New Roman" w:hAnsi="Times New Roman" w:cs="Times New Roman"/>
-        </w:rPr>
       </w:r>
     </w:p>
     <w:p>
@@ -138,57 +100,6 @@
         </w:rPr>
         <w:t>Họ và tên:                         {hoTenChuNha}</w:t>
       </w:r>
-      <w:r>
-        <w:rPr>
-          <w:rFonts w:ascii="Times New Roman" w:hAnsi="Times New Roman" w:cs="Times New Roman"/>
-          <w:sz w:val="26"/>
-          <w:szCs w:val="26"/>
-        </w:rPr>
-      </w:r>
-      <w:r>
-        <w:rPr>
-          <w:rFonts w:ascii="Times New Roman" w:hAnsi="Times New Roman" w:cs="Times New Roman"/>
-          <w:sz w:val="26"/>
-          <w:szCs w:val="26"/>
-        </w:rPr>
-      </w:r>
-      <w:r>
-        <w:rPr>
-          <w:rFonts w:ascii="Times New Roman" w:hAnsi="Times New Roman" w:cs="Times New Roman"/>
-          <w:sz w:val="26"/>
-          <w:szCs w:val="26"/>
-        </w:rPr>
-      </w:r>
-      <w:r>
-        <w:rPr>
-          <w:rFonts w:ascii="Times New Roman" w:hAnsi="Times New Roman" w:cs="Times New Roman"/>
-          <w:sz w:val="26"/>
-          <w:szCs w:val="26"/>
-        </w:rPr>
-      </w:r>
-      <w:r>
-        <w:rPr>
-          <w:rFonts w:ascii="Times New Roman" w:hAnsi="Times New Roman" w:cs="Times New Roman"/>
-          <w:sz w:val="26"/>
-          <w:szCs w:val="26"/>
-        </w:rPr>
-      </w:r>
-      <w:r>
-        <w:rPr>
-          <w:rFonts w:ascii="Times New Roman" w:hAnsi="Times New Roman" w:cs="Times New Roman"/>
-          <w:sz w:val="26"/>
-          <w:szCs w:val="26"/>
-        </w:rPr>
-      </w:r>
-      <w:r>
-        <w:rPr>
-          <w:rFonts w:ascii="Times New Roman" w:hAnsi="Times New Roman" w:cs="Times New Roman"/>
-          <w:b/>
-          <w:bCs/>
-          <w:sz w:val="26"/>
-          <w:szCs w:val="26"/>
-        </w:rPr>
-      </w:r>
     </w:p>
     <w:p>
       <w:pPr>
@@ -214,57 +125,6 @@
         </w:rPr>
         <w:t>CCCD số:                         {cccdChuNha}</w:t>
       </w:r>
-      <w:r>
-        <w:rPr>
-          <w:rFonts w:ascii="Times New Roman" w:hAnsi="Times New Roman" w:cs="Times New Roman"/>
-          <w:sz w:val="26"/>
-          <w:szCs w:val="26"/>
-        </w:rPr>
-      </w:r>
-      <w:r>
-        <w:rPr>
-          <w:rFonts w:ascii="Times New Roman" w:hAnsi="Times New Roman" w:cs="Times New Roman"/>
-          <w:sz w:val="26"/>
-          <w:szCs w:val="26"/>
-        </w:rPr>
-      </w:r>
-      <w:r>
-        <w:rPr>
-          <w:rFonts w:ascii="Times New Roman" w:hAnsi="Times New Roman" w:cs="Times New Roman"/>
-          <w:sz w:val="26"/>
-          <w:szCs w:val="26"/>
-        </w:rPr>
-      </w:r>
-      <w:r>
-        <w:rPr>
-          <w:rFonts w:ascii="Times New Roman" w:hAnsi="Times New Roman" w:cs="Times New Roman"/>
-          <w:sz w:val="26"/>
-          <w:szCs w:val="26"/>
-        </w:rPr>
-      </w:r>
-      <w:r>
-        <w:rPr>
-          <w:rFonts w:ascii="Times New Roman" w:hAnsi="Times New Roman" w:cs="Times New Roman"/>
-          <w:sz w:val="26"/>
-          <w:szCs w:val="26"/>
-        </w:rPr>
-      </w:r>
-      <w:r>
-        <w:rPr>
-          <w:rFonts w:ascii="Times New Roman" w:hAnsi="Times New Roman" w:cs="Times New Roman"/>
-          <w:sz w:val="26"/>
-          <w:szCs w:val="26"/>
-        </w:rPr>
-      </w:r>
-      <w:r>
-        <w:rPr>
-          <w:rFonts w:ascii="Times New Roman" w:hAnsi="Times New Roman" w:cs="Times New Roman"/>
-          <w:b/>
-          <w:bCs/>
-          <w:sz w:val="26"/>
-          <w:szCs w:val="26"/>
-        </w:rPr>
-      </w:r>
     </w:p>
     <w:p>
       <w:pPr>
@@ -290,50 +150,6 @@
         </w:rPr>
         <w:t>Địa chỉ:                         {diaChiChuNha}</w:t>
       </w:r>
-      <w:r>
-        <w:rPr>
-          <w:rFonts w:ascii="Times New Roman" w:hAnsi="Times New Roman" w:cs="Times New Roman"/>
-          <w:sz w:val="26"/>
-          <w:szCs w:val="26"/>
-        </w:rPr>
-      </w:r>
-      <w:r>
-        <w:rPr>
-          <w:rFonts w:ascii="Times New Roman" w:hAnsi="Times New Roman" w:cs="Times New Roman"/>
-          <w:sz w:val="26"/>
-          <w:szCs w:val="26"/>
-        </w:rPr>
-      </w:r>
-      <w:r>
-        <w:rPr>
-          <w:rFonts w:ascii="Times New Roman" w:hAnsi="Times New Roman" w:cs="Times New Roman"/>
-          <w:sz w:val="26"/>
-          <w:szCs w:val="26"/>
-        </w:rPr>
-      </w:r>
-      <w:r>
-        <w:rPr>
-          <w:rFonts w:ascii="Times New Roman" w:hAnsi="Times New Roman" w:cs="Times New Roman"/>
-          <w:sz w:val="26"/>
-          <w:szCs w:val="26"/>
-        </w:rPr>
-      </w:r>
-      <w:r>
-        <w:rPr>
-          <w:rFonts w:ascii="Times New Roman" w:hAnsi="Times New Roman" w:cs="Times New Roman"/>
-          <w:sz w:val="26"/>
-          <w:szCs w:val="26"/>
-        </w:rPr>
-      </w:r>
-      <w:r>
-        <w:rPr>
-          <w:rFonts w:ascii="Times New Roman" w:hAnsi="Times New Roman" w:cs="Times New Roman"/>
-          <w:b/>
-          <w:bCs/>
-          <w:sz w:val="26"/>
-          <w:szCs w:val="26"/>
-        </w:rPr>
-      </w:r>
     </w:p>
     <w:p>
       <w:pPr>
@@ -356,13 +172,6 @@
         </w:rPr>
         <w:t>Điện thoại: {dienThoaiChuNha}</w:t>
       </w:r>
-      <w:r>
-        <w:rPr>
-          <w:rFonts w:ascii="Times New Roman" w:hAnsi="Times New Roman" w:cs="Times New Roman"/>
-          <w:sz w:val="26"/>
-          <w:szCs w:val="26"/>
-        </w:rPr>
-      </w:r>
     </w:p>
     <w:p>
       <w:pPr>
@@ -385,22 +194,6 @@
         </w:rPr>
         <w:t>Quản lý tòa nhà: {quanLyToaNha}</w:t>
       </w:r>
-      <w:proofErr w:type="gramStart"/>
-      <w:r>
-        <w:rPr>
-          <w:rFonts w:ascii="Times New Roman" w:hAnsi="Times New Roman" w:cs="Times New Roman"/>
-          <w:sz w:val="26"/>
-          <w:szCs w:val="26"/>
-        </w:rPr>
-      </w:r>
-      <w:proofErr w:type="gramEnd"/>
-      <w:r>
-        <w:rPr>
-          <w:rFonts w:ascii="Times New Roman" w:hAnsi="Times New Roman" w:cs="Times New Roman"/>
-          <w:sz w:val="26"/>
-          <w:szCs w:val="26"/>
-        </w:rPr>
-      </w:r>
     </w:p>
     <w:p>
       <w:pPr>
@@ -441,20 +234,6 @@
         </w:rPr>
         <w:t>Họ và tên: {hoTen}</w:t>
       </w:r>
-      <w:r>
-        <w:rPr>
-          <w:rFonts w:ascii="Times New Roman" w:hAnsi="Times New Roman" w:cs="Times New Roman"/>
-          <w:sz w:val="26"/>
-          <w:szCs w:val="26"/>
-        </w:rPr>
-      </w:r>
-      <w:r>
-        <w:rPr>
-          <w:rFonts w:ascii="Times New Roman" w:hAnsi="Times New Roman" w:cs="Times New Roman"/>
-          <w:sz w:val="26"/>
-          <w:szCs w:val="26"/>
-        </w:rPr>
-      </w:r>
     </w:p>
     <w:p>
       <w:pPr>
@@ -477,20 +256,6 @@
         </w:rPr>
         <w:t>CCCD số: {cccd}</w:t>
       </w:r>
-      <w:r>
-        <w:rPr>
-          <w:rFonts w:ascii="Times New Roman" w:hAnsi="Times New Roman" w:cs="Times New Roman"/>
-          <w:sz w:val="26"/>
-          <w:szCs w:val="26"/>
-        </w:rPr>
-      </w:r>
-      <w:r>
-        <w:rPr>
-          <w:rFonts w:ascii="Times New Roman" w:hAnsi="Times New Roman" w:cs="Times New Roman"/>
-          <w:sz w:val="26"/>
-          <w:szCs w:val="26"/>
-        </w:rPr>
-      </w:r>
     </w:p>
     <w:p>
       <w:pPr>
@@ -513,20 +278,6 @@
         </w:rPr>
         <w:t>Địa chỉ thường trú: {diaChi}</w:t>
       </w:r>
-      <w:r>
-        <w:rPr>
-          <w:rFonts w:ascii="Times New Roman" w:hAnsi="Times New Roman" w:cs="Times New Roman"/>
-          <w:sz w:val="26"/>
-          <w:szCs w:val="26"/>
-        </w:rPr>
-      </w:r>
-      <w:r>
-        <w:rPr>
-          <w:rFonts w:ascii="Times New Roman" w:hAnsi="Times New Roman" w:cs="Times New Roman"/>
-          <w:sz w:val="26"/>
-          <w:szCs w:val="26"/>
-        </w:rPr>
-      </w:r>
     </w:p>
     <w:p>
       <w:pPr>
@@ -549,20 +300,6 @@
         </w:rPr>
         <w:t>Điện thoại: {dienThoai}</w:t>
       </w:r>
-      <w:r>
-        <w:rPr>
-          <w:rFonts w:ascii="Times New Roman" w:hAnsi="Times New Roman" w:cs="Times New Roman"/>
-          <w:sz w:val="26"/>
-          <w:szCs w:val="26"/>
-        </w:rPr>
-      </w:r>
-      <w:r>
-        <w:rPr>
-          <w:rFonts w:ascii="Times New Roman" w:hAnsi="Times New Roman" w:cs="Times New Roman"/>
-          <w:sz w:val="26"/>
-          <w:szCs w:val="26"/>
-        </w:rPr>
-      </w:r>
     </w:p>
     <w:p>
       <w:pPr>
@@ -621,14 +358,6 @@
         </w:rPr>
         <w:t>Địa chỉ: {diachiToanha}</w:t>
       </w:r>
-      <w:r/>
-      <w:r>
-        <w:rPr>
-          <w:rFonts w:ascii="Times New Roman" w:hAnsi="Times New Roman" w:cs="Times New Roman"/>
-          <w:sz w:val="26"/>
-          <w:szCs w:val="26"/>
-        </w:rPr>
-      </w:r>
     </w:p>
     <w:p>
       <w:pPr>
@@ -656,13 +385,6 @@
         </w:rPr>
         <w:t>Số phòng: {maPhong}</w:t>
       </w:r>
-      <w:r>
-        <w:rPr>
-          <w:rFonts w:ascii="Times New Roman" w:hAnsi="Times New Roman" w:cs="Times New Roman"/>
-          <w:sz w:val="26"/>
-          <w:szCs w:val="26"/>
-        </w:rPr>
-      </w:r>
     </w:p>
     <w:p>
       <w:pPr>
@@ -721,61 +443,21 @@
         </w:rPr>
         <w:t>Bên B giao cho Bên A số tiền đặt cọc:</w:t>
       </w:r>
-    </w:p>
-    <w:p>
-      <w:pPr>
-        <w:tabs>
-          <w:tab w:val="left" w:leader="dot" w:pos="9072"/>
-        </w:tabs>
-        <w:jc w:val="both"/>
-        <w:rPr>
-          <w:rFonts w:ascii="Times New Roman" w:hAnsi="Times New Roman" w:cs="Times New Roman"/>
-          <w:sz w:val="26"/>
-          <w:szCs w:val="26"/>
-        </w:rPr>
-      </w:pPr>
-      <w:r>
-        <w:rPr>
-          <w:rFonts w:ascii="Times New Roman" w:hAnsi="Times New Roman" w:cs="Times New Roman"/>
-          <w:sz w:val="26"/>
-          <w:szCs w:val="26"/>
-        </w:rPr>
-        <w:t>Số tiền: {tienCoc} VNĐ (Bằng chữ: {tienCocChu})</w:t>
-      </w:r>
-      <w:r>
-        <w:rPr>
-          <w:rFonts w:ascii="Times New Roman" w:hAnsi="Times New Roman" w:cs="Times New Roman"/>
-          <w:sz w:val="26"/>
-          <w:szCs w:val="26"/>
-        </w:rPr>
-      </w:r>
-      <w:r>
-        <w:rPr>
-          <w:rFonts w:ascii="Times New Roman" w:hAnsi="Times New Roman" w:cs="Times New Roman"/>
-          <w:sz w:val="26"/>
-          <w:szCs w:val="26"/>
-        </w:rPr>
-      </w:r>
-      <w:r>
-        <w:rPr>
-          <w:rFonts w:ascii="Times New Roman" w:hAnsi="Times New Roman" w:cs="Times New Roman"/>
-          <w:sz w:val="26"/>
-          <w:szCs w:val="26"/>
-        </w:rPr>
-      </w:r>
-      <w:r>
-        <w:rPr>
-          <w:rFonts w:ascii="Times New Roman" w:hAnsi="Times New Roman" w:cs="Times New Roman"/>
-          <w:sz w:val="26"/>
-          <w:szCs w:val="26"/>
-        </w:rPr>
-      </w:r>
-      <w:r>
-        <w:rPr>
-          <w:rFonts w:ascii="Times New Roman" w:hAnsi="Times New Roman" w:cs="Times New Roman"/>
-          <w:sz w:val="26"/>
-          <w:szCs w:val="26"/>
-        </w:rPr>
+      <w:r>
+        <w:rPr>
+          <w:rFonts w:ascii="Times New Roman" w:hAnsi="Times New Roman" w:cs="Times New Roman"/>
+          <w:sz w:val="26"/>
+          <w:szCs w:val="26"/>
+        </w:rPr>
+        <w:t xml:space="preserve"> </w:t>
+      </w:r>
+      <w:r>
+        <w:rPr>
+          <w:rFonts w:ascii="Times New Roman" w:hAnsi="Times New Roman" w:cs="Times New Roman"/>
+          <w:sz w:val="26"/>
+          <w:szCs w:val="26"/>
+        </w:rPr>
+        <w:t>{tienCoc} VNĐ (Bằng chữ: {tienCocChu})</w:t>
       </w:r>
     </w:p>
     <w:p>
@@ -817,38 +499,6 @@
         </w:rPr>
         <w:t>Giữ phòng đến ngày {ngayGiuPhongDen}</w:t>
       </w:r>
-      <w:proofErr w:type="gramStart"/>
-      <w:r>
-        <w:rPr>
-          <w:rFonts w:ascii="Times New Roman" w:hAnsi="Times New Roman" w:cs="Times New Roman"/>
-          <w:sz w:val="26"/>
-          <w:szCs w:val="26"/>
-        </w:rPr>
-      </w:r>
-      <w:proofErr w:type="gramEnd"/>
-      <w:r>
-        <w:rPr>
-          <w:rFonts w:ascii="Times New Roman" w:hAnsi="Times New Roman" w:cs="Times New Roman"/>
-          <w:sz w:val="26"/>
-          <w:szCs w:val="26"/>
-        </w:rPr>
-      </w:r>
-      <w:proofErr w:type="gramStart"/>
-      <w:r>
-        <w:rPr>
-          <w:rFonts w:ascii="Times New Roman" w:hAnsi="Times New Roman" w:cs="Times New Roman"/>
-          <w:sz w:val="26"/>
-          <w:szCs w:val="26"/>
-        </w:rPr>
-      </w:r>
-      <w:proofErr w:type="gramEnd"/>
-      <w:r>
-        <w:rPr>
-          <w:rFonts w:ascii="Times New Roman" w:hAnsi="Times New Roman" w:cs="Times New Roman"/>
-          <w:sz w:val="26"/>
-          <w:szCs w:val="26"/>
-        </w:rPr>
-      </w:r>
     </w:p>
     <w:p>
       <w:pPr>
@@ -929,45 +579,6 @@
         </w:rPr>
         <w:t>Bên B cam kết nhận phòng vào ngày {ngayDuKienVaoO}.</w:t>
       </w:r>
-      <w:proofErr w:type="gramStart"/>
-      <w:r>
-        <w:rPr>
-          <w:rFonts w:ascii="Times New Roman" w:hAnsi="Times New Roman" w:cs="Times New Roman"/>
-          <w:sz w:val="26"/>
-          <w:szCs w:val="26"/>
-        </w:rPr>
-      </w:r>
-      <w:proofErr w:type="gramEnd"/>
-      <w:r>
-        <w:rPr>
-          <w:rFonts w:ascii="Times New Roman" w:hAnsi="Times New Roman" w:cs="Times New Roman"/>
-          <w:sz w:val="26"/>
-          <w:szCs w:val="26"/>
-        </w:rPr>
-      </w:r>
-      <w:proofErr w:type="gramStart"/>
-      <w:r>
-        <w:rPr>
-          <w:rFonts w:ascii="Times New Roman" w:hAnsi="Times New Roman" w:cs="Times New Roman"/>
-          <w:sz w:val="26"/>
-          <w:szCs w:val="26"/>
-        </w:rPr>
-      </w:r>
-      <w:r>
-        <w:rPr>
-          <w:rFonts w:ascii="Times New Roman" w:hAnsi="Times New Roman" w:cs="Times New Roman"/>
-          <w:sz w:val="26"/>
-          <w:szCs w:val="26"/>
-        </w:rPr>
-      </w:r>
-      <w:proofErr w:type="gramEnd"/>
-      <w:r>
-        <w:rPr>
-          <w:rFonts w:ascii="Times New Roman" w:hAnsi="Times New Roman" w:cs="Times New Roman"/>
-          <w:sz w:val="26"/>
-          <w:szCs w:val="26"/>
-        </w:rPr>
-      </w:r>
     </w:p>
     <w:p>
       <w:pPr>
@@ -988,7 +599,6 @@
           <w:sz w:val="26"/>
           <w:szCs w:val="26"/>
         </w:rPr>
-        <w:lastRenderedPageBreak/>
         <w:t>Khi nhận phòng, Bên B phải thanh toán đầy đủ các khoản sau:</w:t>
       </w:r>
     </w:p>
@@ -1011,35 +621,8 @@
           <w:sz w:val="26"/>
           <w:szCs w:val="26"/>
         </w:rPr>
+        <w:lastRenderedPageBreak/>
         <w:t>Tiền thuê tháng đầu tiên: {tienThueThangDau} đồng.</w:t>
-      </w:r>
-      <w:r>
-        <w:rPr>
-          <w:rFonts w:ascii="Times New Roman" w:hAnsi="Times New Roman" w:cs="Times New Roman"/>
-          <w:sz w:val="26"/>
-          <w:szCs w:val="26"/>
-        </w:rPr>
-      </w:r>
-      <w:r>
-        <w:rPr>
-          <w:rFonts w:ascii="Times New Roman" w:hAnsi="Times New Roman" w:cs="Times New Roman"/>
-          <w:sz w:val="26"/>
-          <w:szCs w:val="26"/>
-        </w:rPr>
-      </w:r>
-      <w:r>
-        <w:rPr>
-          <w:rFonts w:ascii="Times New Roman" w:hAnsi="Times New Roman" w:cs="Times New Roman"/>
-          <w:sz w:val="26"/>
-          <w:szCs w:val="26"/>
-        </w:rPr>
-      </w:r>
-      <w:r>
-        <w:rPr>
-          <w:rFonts w:ascii="Times New Roman" w:hAnsi="Times New Roman" w:cs="Times New Roman"/>
-          <w:sz w:val="26"/>
-          <w:szCs w:val="26"/>
-        </w:rPr>
       </w:r>
     </w:p>
     <w:p>
@@ -1063,34 +646,6 @@
         </w:rPr>
         <w:t>Tiền cọc thuê nhà (nếu có): {tienCocThueNha} đồng.</w:t>
       </w:r>
-      <w:r>
-        <w:rPr>
-          <w:rFonts w:ascii="Times New Roman" w:hAnsi="Times New Roman" w:cs="Times New Roman"/>
-          <w:sz w:val="26"/>
-          <w:szCs w:val="26"/>
-        </w:rPr>
-      </w:r>
-      <w:r>
-        <w:rPr>
-          <w:rFonts w:ascii="Times New Roman" w:hAnsi="Times New Roman" w:cs="Times New Roman"/>
-          <w:sz w:val="26"/>
-          <w:szCs w:val="26"/>
-        </w:rPr>
-      </w:r>
-      <w:r>
-        <w:rPr>
-          <w:rFonts w:ascii="Times New Roman" w:hAnsi="Times New Roman" w:cs="Times New Roman"/>
-          <w:sz w:val="26"/>
-          <w:szCs w:val="26"/>
-        </w:rPr>
-      </w:r>
-      <w:r>
-        <w:rPr>
-          <w:rFonts w:ascii="Times New Roman" w:hAnsi="Times New Roman" w:cs="Times New Roman"/>
-          <w:sz w:val="26"/>
-          <w:szCs w:val="26"/>
-        </w:rPr>
-      </w:r>
     </w:p>
     <w:p>
       <w:pPr>
@@ -1113,20 +668,6 @@
         </w:rPr>
         <w:t>Các khoản phí khác (nếu có): {phiKhac} đồng.</w:t>
       </w:r>
-      <w:r>
-        <w:rPr>
-          <w:rFonts w:ascii="Times New Roman" w:hAnsi="Times New Roman" w:cs="Times New Roman"/>
-          <w:sz w:val="26"/>
-          <w:szCs w:val="26"/>
-        </w:rPr>
-      </w:r>
-      <w:r>
-        <w:rPr>
-          <w:rFonts w:ascii="Times New Roman" w:hAnsi="Times New Roman" w:cs="Times New Roman"/>
-          <w:sz w:val="26"/>
-          <w:szCs w:val="26"/>
-        </w:rPr>
-      </w:r>
     </w:p>
     <w:p>
       <w:pPr>
@@ -1144,20 +685,6 @@
           <w:szCs w:val="26"/>
         </w:rPr>
         <w:t>Tổng số tiền phải thanh toán khi nhận phòng: {tongThanhToanKhiNhanPhong} đồng.</w:t>
-      </w:r>
-      <w:r>
-        <w:rPr>
-          <w:rFonts w:ascii="Times New Roman" w:hAnsi="Times New Roman" w:cs="Times New Roman"/>
-          <w:sz w:val="26"/>
-          <w:szCs w:val="26"/>
-        </w:rPr>
-      </w:r>
-      <w:r>
-        <w:rPr>
-          <w:rFonts w:ascii="Times New Roman" w:hAnsi="Times New Roman" w:cs="Times New Roman"/>
-          <w:sz w:val="26"/>
-          <w:szCs w:val="26"/>
-        </w:rPr>
       </w:r>
     </w:p>
     <w:p>
@@ -2040,7 +1567,7 @@
 </file>
 
 <file path=word/numbering.xml><?xml version="1.0" encoding="utf-8"?>
-<w:numbering xmlns:wpc="http://schemas.microsoft.com/office/word/2010/wordprocessingCanvas" xmlns:cx="http://schemas.microsoft.com/office/drawing/2014/chartex" xmlns:cx1="http://schemas.microsoft.com/office/drawing/2015/9/8/chartex" xmlns:cx2="http://schemas.microsoft.com/office/drawing/2015/10/21/chartex" xmlns:cx3="http://schemas.microsoft.com/office/drawing/2016/5/9/chartex" xmlns:cx4="http://schemas.microsoft.com/office/drawing/2016/5/10/chartex" xmlns:cx5="http://schemas.microsoft.com/office/drawing/2016/5/11/chartex" xmlns:cx6="http://schemas.microsoft.com/office/drawing/2016/5/12/chartex" xmlns:cx7="http://schemas.microsoft.com/office/drawing/2016/5/13/chartex" xmlns:cx8="http://schemas.microsoft.com/office/drawing/2016/5/14/chartex" xmlns:mc="http://schemas.openxmlformats.org/markup-compatibility/2006" xmlns:aink="http://schemas.microsoft.com/office/drawing/2016/ink" xmlns:am3d="http://schemas.microsoft.com/office/drawing/2017/model3d" xmlns:o="urn:schemas-microsoft-com:office:office" xmlns:oel="http://schemas.microsoft.com/office/2019/extlst" xmlns:r="http://schemas.openxmlformats.org/officeDocument/2006/relationships" xmlns:m="http://schemas.openxmlformats.org/officeDocument/2006/math" xmlns:v="urn:schemas-microsoft-com:vml" xmlns:wp14="http://schemas.microsoft.com/office/word/2010/wordprocessingDrawing" xmlns:wp="http://schemas.openxmlformats.org/drawingml/2006/wordprocessingDrawing" xmlns:w10="urn:schemas-microsoft-com:office:word" xmlns:w="http://schemas.openxmlformats.org/wordprocessingml/2006/main" xmlns:w14="http://schemas.microsoft.com/office/word/2010/wordml" xmlns:w15="http://schemas.microsoft.com/office/word/2012/wordml" xmlns:w16cei="http://schemas.microsoft.com/office/word/2026/wordml/cei" xmlns:w16cex="http://schemas.microsoft.com/office/word/2018/wordml/cex" xmlns:w16cid="http://schemas.microsoft.com/office/word/2016/wordml/cid" xmlns:w16="http://schemas.microsoft.com/office/word/2018/wordml" xmlns:w16du="http://schemas.microsoft.com/office/word/2023/wordml/word16du" xmlns:w16sdtdh="http://schemas.microsoft.com/office/word/2020/wordml/sdtdatahash" xmlns:w16sdtfl="http://schemas.microsoft.com/office/word/2024/wordml/sdtformatlock" xmlns:w16se="http://schemas.microsoft.com/office/word/2015/wordml/symex" xmlns:wpg="http://schemas.microsoft.com/office/word/2010/wordprocessingGroup" xmlns:wpi="http://schemas.microsoft.com/office/word/2010/wordprocessingInk" xmlns:wne="http://schemas.microsoft.com/office/word/2006/wordml" xmlns:wps="http://schemas.microsoft.com/office/word/2010/wordprocessingShape" mc:Ignorable="w14 w15 w16se w16cid w16 w16cex w16sdtdh w16sdtfl w16du wp14">
+<w:numbering xmlns:wpc="http://schemas.microsoft.com/office/word/2010/wordprocessingCanvas" xmlns:cx="http://schemas.microsoft.com/office/drawing/2014/chartex" xmlns:cx1="http://schemas.microsoft.com/office/drawing/2015/9/8/chartex" xmlns:cx2="http://schemas.microsoft.com/office/drawing/2015/10/21/chartex" xmlns:cx3="http://schemas.microsoft.com/office/drawing/2016/5/9/chartex" xmlns:cx4="http://schemas.microsoft.com/office/drawing/2016/5/10/chartex" xmlns:cx5="http://schemas.microsoft.com/office/drawing/2016/5/11/chartex" xmlns:cx6="http://schemas.microsoft.com/office/drawing/2016/5/12/chartex" xmlns:cx7="http://schemas.microsoft.com/office/drawing/2016/5/13/chartex" xmlns:cx8="http://schemas.microsoft.com/office/drawing/2016/5/14/chartex" xmlns:mc="http://schemas.openxmlformats.org/markup-compatibility/2006" xmlns:aink="http://schemas.microsoft.com/office/drawing/2016/ink" xmlns:am3d="http://schemas.microsoft.com/office/drawing/2017/model3d" xmlns:o="urn:schemas-microsoft-com:office:office" xmlns:oel="http://schemas.microsoft.com/office/2019/extlst" xmlns:r="http://schemas.openxmlformats.org/officeDocument/2006/relationships" xmlns:m="http://schemas.openxmlformats.org/officeDocument/2006/math" xmlns:v="urn:schemas-microsoft-com:vml" xmlns:wp14="http://schemas.microsoft.com/office/word/2010/wordprocessingDrawing" xmlns:wp="http://schemas.openxmlformats.org/drawingml/2006/wordprocessingDrawing" xmlns:w10="urn:schemas-microsoft-com:office:word" xmlns:w="http://schemas.openxmlformats.org/wordprocessingml/2006/main" xmlns:w14="http://schemas.microsoft.com/office/word/2010/wordml" xmlns:w15="http://schemas.microsoft.com/office/word/2012/wordml" xmlns:w16cex="http://schemas.microsoft.com/office/word/2018/wordml/cex" xmlns:w16cid="http://schemas.microsoft.com/office/word/2016/wordml/cid" xmlns:w16="http://schemas.microsoft.com/office/word/2018/wordml" xmlns:w16du="http://schemas.microsoft.com/office/word/2023/wordml/word16du" xmlns:w16sdtdh="http://schemas.microsoft.com/office/word/2020/wordml/sdtdatahash" xmlns:w16sdtfl="http://schemas.microsoft.com/office/word/2024/wordml/sdtformatlock" xmlns:w16se="http://schemas.microsoft.com/office/word/2015/wordml/symex" xmlns:wpg="http://schemas.microsoft.com/office/word/2010/wordprocessingGroup" xmlns:wpi="http://schemas.microsoft.com/office/word/2010/wordprocessingInk" xmlns:wne="http://schemas.microsoft.com/office/word/2006/wordml" xmlns:wps="http://schemas.microsoft.com/office/word/2010/wordprocessingShape" mc:Ignorable="w14 w15 w16se w16cid w16 w16cex w16sdtdh w16sdtfl w16du wp14">
   <w:abstractNum w:abstractNumId="0" w15:restartNumberingAfterBreak="0">
     <w:nsid w:val="03A86B89"/>
     <w:multiLevelType w:val="multilevel"/>

</xml_diff>